<commit_message>
task-1-2: cover page and problem statement
</commit_message>
<xml_diff>
--- a/hackaithon-de-tai-6-vong-1/proposal.docx
+++ b/hackaithon-de-tai-6-vong-1/proposal.docx
@@ -300,6 +300,584 @@
           <w:sz w:val="28"/>
         </w:rPr>
         <w:t>Ngày nộp: 16/06/2026</w:t>
+      </w:r>
+    </w:p>
+    <w:p>
+      <w:r>
+        <w:br w:type="page"/>
+      </w:r>
+    </w:p>
+    <w:p>
+      <w:pPr>
+        <w:jc w:val="left"/>
+        <w:pBdr>
+          <w:bottom w:val="single" w:sz="8" w:space="1" w:color="0066CC"/>
+        </w:pBdr>
+      </w:pPr>
+      <w:r>
+        <w:rPr>
+          <w:rFonts w:ascii="Times New Roman" w:hAnsi="Times New Roman" w:eastAsia="Times New Roman"/>
+          <w:b/>
+          <w:color w:val="0066CC"/>
+          <w:sz w:val="36"/>
+        </w:rPr>
+        <w:t>1. ĐẶT VẤN ĐỀ</w:t>
+      </w:r>
+    </w:p>
+    <w:p>
+      <w:pPr>
+        <w:jc w:val="left"/>
+      </w:pPr>
+      <w:r>
+        <w:rPr>
+          <w:rFonts w:ascii="Times New Roman" w:hAnsi="Times New Roman" w:eastAsia="Times New Roman"/>
+          <w:b/>
+          <w:color w:val="0066CC"/>
+          <w:sz w:val="32"/>
+        </w:rPr>
+        <w:t>1.1 Bối cảnh</w:t>
+      </w:r>
+    </w:p>
+    <w:p>
+      <w:pPr>
+        <w:spacing w:line="360" w:lineRule="auto"/>
+        <w:ind w:firstLine="720"/>
+        <w:jc w:val="both"/>
+      </w:pPr>
+      <w:r>
+        <w:rPr>
+          <w:rFonts w:ascii="Times New Roman" w:hAnsi="Times New Roman" w:eastAsia="Times New Roman"/>
+          <w:b w:val="0"/>
+          <w:sz w:val="28"/>
+        </w:rPr>
+        <w:t>Chuyển đổi số hành chính công là nhiệm vụ trọng tâm của Chính phủ giai đoạn 2026-2030. Cổng Dịch vụ công Quốc gia đã đạt hơn 4.000 thủ tục hành chính trực tuyến, nhưng tỷ lệ người dân sử dụng còn thấp (~30%) do rào cản công nghệ và giao diện phức tạp.</w:t>
+      </w:r>
+    </w:p>
+    <w:p>
+      <w:pPr>
+        <w:jc w:val="left"/>
+      </w:pPr>
+      <w:r>
+        <w:rPr>
+          <w:rFonts w:ascii="Times New Roman" w:hAnsi="Times New Roman" w:eastAsia="Times New Roman"/>
+          <w:b/>
+          <w:color w:val="0066CC"/>
+          <w:sz w:val="32"/>
+        </w:rPr>
+        <w:t>1.2 Ba Pain-point chính</w:t>
+      </w:r>
+    </w:p>
+    <w:tbl>
+      <w:tblPr>
+        <w:tblStyle w:val="TableGrid"/>
+        <w:tblW w:type="auto" w:w="0"/>
+        <w:jc w:val="center"/>
+        <w:tblLook w:firstColumn="1" w:firstRow="1" w:lastColumn="0" w:lastRow="0" w:noHBand="0" w:noVBand="1" w:val="04A0"/>
+      </w:tblPr>
+      <w:tblGrid>
+        <w:gridCol w:w="2268"/>
+        <w:gridCol w:w="2268"/>
+        <w:gridCol w:w="2268"/>
+        <w:gridCol w:w="2268"/>
+      </w:tblGrid>
+      <w:tr>
+        <w:tc>
+          <w:tcPr>
+            <w:tcW w:type="dxa" w:w="454"/>
+            <w:shd w:fill="0066CC" w:val="clear"/>
+          </w:tcPr>
+          <w:p>
+            <w:pPr>
+              <w:jc w:val="center"/>
+            </w:pPr>
+            <w:r/>
+            <w:r>
+              <w:rPr>
+                <w:rFonts w:ascii="Times New Roman" w:hAnsi="Times New Roman" w:eastAsia="Times New Roman"/>
+                <w:b/>
+                <w:color w:val="FFFFFF"/>
+                <w:sz w:val="24"/>
+              </w:rPr>
+              <w:t>#</w:t>
+            </w:r>
+          </w:p>
+        </w:tc>
+        <w:tc>
+          <w:tcPr>
+            <w:tcW w:type="dxa" w:w="2551"/>
+            <w:shd w:fill="0066CC" w:val="clear"/>
+          </w:tcPr>
+          <w:p>
+            <w:pPr>
+              <w:jc w:val="center"/>
+            </w:pPr>
+            <w:r/>
+            <w:r>
+              <w:rPr>
+                <w:rFonts w:ascii="Times New Roman" w:hAnsi="Times New Roman" w:eastAsia="Times New Roman"/>
+                <w:b/>
+                <w:color w:val="FFFFFF"/>
+                <w:sz w:val="24"/>
+              </w:rPr>
+              <w:t>Pain-point</w:t>
+            </w:r>
+          </w:p>
+        </w:tc>
+        <w:tc>
+          <w:tcPr>
+            <w:tcW w:type="dxa" w:w="4535"/>
+            <w:shd w:fill="0066CC" w:val="clear"/>
+          </w:tcPr>
+          <w:p>
+            <w:pPr>
+              <w:jc w:val="center"/>
+            </w:pPr>
+            <w:r/>
+            <w:r>
+              <w:rPr>
+                <w:rFonts w:ascii="Times New Roman" w:hAnsi="Times New Roman" w:eastAsia="Times New Roman"/>
+                <w:b/>
+                <w:color w:val="FFFFFF"/>
+                <w:sz w:val="24"/>
+              </w:rPr>
+              <w:t>Minh chứng</w:t>
+            </w:r>
+          </w:p>
+        </w:tc>
+        <w:tc>
+          <w:tcPr>
+            <w:tcW w:type="dxa" w:w="1701"/>
+            <w:shd w:fill="0066CC" w:val="clear"/>
+          </w:tcPr>
+          <w:p>
+            <w:pPr>
+              <w:jc w:val="center"/>
+            </w:pPr>
+            <w:r/>
+            <w:r>
+              <w:rPr>
+                <w:rFonts w:ascii="Times New Roman" w:hAnsi="Times New Roman" w:eastAsia="Times New Roman"/>
+                <w:b/>
+                <w:color w:val="FFFFFF"/>
+                <w:sz w:val="24"/>
+              </w:rPr>
+              <w:t>Đối tượng chịu ảnh hưởng</w:t>
+            </w:r>
+          </w:p>
+        </w:tc>
+      </w:tr>
+      <w:tr>
+        <w:tc>
+          <w:tcPr>
+            <w:tcW w:type="dxa" w:w="454"/>
+          </w:tcPr>
+          <w:p>
+            <w:pPr>
+              <w:jc w:val="center"/>
+            </w:pPr>
+            <w:r/>
+            <w:r>
+              <w:rPr>
+                <w:rFonts w:ascii="Times New Roman" w:hAnsi="Times New Roman" w:eastAsia="Times New Roman"/>
+                <w:b w:val="0"/>
+                <w:sz w:val="22"/>
+              </w:rPr>
+              <w:t>PP1</w:t>
+            </w:r>
+          </w:p>
+        </w:tc>
+        <w:tc>
+          <w:tcPr>
+            <w:tcW w:type="dxa" w:w="2551"/>
+          </w:tcPr>
+          <w:p>
+            <w:pPr>
+              <w:jc w:val="left"/>
+            </w:pPr>
+            <w:r/>
+            <w:r>
+              <w:rPr>
+                <w:rFonts w:ascii="Times New Roman" w:hAnsi="Times New Roman" w:eastAsia="Times New Roman"/>
+                <w:b w:val="0"/>
+                <w:sz w:val="22"/>
+              </w:rPr>
+              <w:t>Ngôn ngữ hành chính phức tạp, khó tra cứu</w:t>
+            </w:r>
+          </w:p>
+        </w:tc>
+        <w:tc>
+          <w:tcPr>
+            <w:tcW w:type="dxa" w:w="4535"/>
+          </w:tcPr>
+          <w:p>
+            <w:pPr>
+              <w:jc w:val="left"/>
+            </w:pPr>
+            <w:r/>
+            <w:r>
+              <w:rPr>
+                <w:rFonts w:ascii="Times New Roman" w:hAnsi="Times New Roman" w:eastAsia="Times New Roman"/>
+                <w:b w:val="0"/>
+                <w:sz w:val="22"/>
+              </w:rPr>
+              <w:t>65% người &gt;60 tuổi không tự tra cứu được thủ tục online (Bộ TT&amp;TT 2025)</w:t>
+            </w:r>
+          </w:p>
+        </w:tc>
+        <w:tc>
+          <w:tcPr>
+            <w:tcW w:type="dxa" w:w="1701"/>
+          </w:tcPr>
+          <w:p>
+            <w:pPr>
+              <w:jc w:val="center"/>
+            </w:pPr>
+            <w:r/>
+            <w:r>
+              <w:rPr>
+                <w:rFonts w:ascii="Times New Roman" w:hAnsi="Times New Roman" w:eastAsia="Times New Roman"/>
+                <w:b w:val="0"/>
+                <w:sz w:val="22"/>
+              </w:rPr>
+              <w:t>Người già, người khuyết tật</w:t>
+            </w:r>
+          </w:p>
+        </w:tc>
+      </w:tr>
+      <w:tr>
+        <w:tc>
+          <w:tcPr>
+            <w:tcW w:type="dxa" w:w="454"/>
+            <w:shd w:fill="E8F0FE" w:val="clear"/>
+          </w:tcPr>
+          <w:p>
+            <w:pPr>
+              <w:jc w:val="center"/>
+            </w:pPr>
+            <w:r/>
+            <w:r>
+              <w:rPr>
+                <w:rFonts w:ascii="Times New Roman" w:hAnsi="Times New Roman" w:eastAsia="Times New Roman"/>
+                <w:b w:val="0"/>
+                <w:sz w:val="22"/>
+              </w:rPr>
+              <w:t>PP2</w:t>
+            </w:r>
+          </w:p>
+        </w:tc>
+        <w:tc>
+          <w:tcPr>
+            <w:tcW w:type="dxa" w:w="2551"/>
+            <w:shd w:fill="E8F0FE" w:val="clear"/>
+          </w:tcPr>
+          <w:p>
+            <w:pPr>
+              <w:jc w:val="left"/>
+            </w:pPr>
+            <w:r/>
+            <w:r>
+              <w:rPr>
+                <w:rFonts w:ascii="Times New Roman" w:hAnsi="Times New Roman" w:eastAsia="Times New Roman"/>
+                <w:b w:val="0"/>
+                <w:sz w:val="22"/>
+              </w:rPr>
+              <w:t>Số hóa hồ sơ chưa triệt để, nhập liệu thủ công</w:t>
+            </w:r>
+          </w:p>
+        </w:tc>
+        <w:tc>
+          <w:tcPr>
+            <w:tcW w:type="dxa" w:w="4535"/>
+            <w:shd w:fill="E8F0FE" w:val="clear"/>
+          </w:tcPr>
+          <w:p>
+            <w:pPr>
+              <w:jc w:val="left"/>
+            </w:pPr>
+            <w:r/>
+            <w:r>
+              <w:rPr>
+                <w:rFonts w:ascii="Times New Roman" w:hAnsi="Times New Roman" w:eastAsia="Times New Roman"/>
+                <w:b w:val="0"/>
+                <w:sz w:val="22"/>
+              </w:rPr>
+              <w:t>Mỗi giao dịch mất 20-30 phút nhập liệu + kiểm tra giấy tờ (UBND TP.HCM 2025)</w:t>
+            </w:r>
+          </w:p>
+        </w:tc>
+        <w:tc>
+          <w:tcPr>
+            <w:tcW w:type="dxa" w:w="1701"/>
+            <w:shd w:fill="E8F0FE" w:val="clear"/>
+          </w:tcPr>
+          <w:p>
+            <w:pPr>
+              <w:jc w:val="center"/>
+            </w:pPr>
+            <w:r/>
+            <w:r>
+              <w:rPr>
+                <w:rFonts w:ascii="Times New Roman" w:hAnsi="Times New Roman" w:eastAsia="Times New Roman"/>
+                <w:b w:val="0"/>
+                <w:sz w:val="22"/>
+              </w:rPr>
+              <w:t>Cán bộ một cửa</w:t>
+            </w:r>
+          </w:p>
+        </w:tc>
+      </w:tr>
+      <w:tr>
+        <w:tc>
+          <w:tcPr>
+            <w:tcW w:type="dxa" w:w="454"/>
+          </w:tcPr>
+          <w:p>
+            <w:pPr>
+              <w:jc w:val="center"/>
+            </w:pPr>
+            <w:r/>
+            <w:r>
+              <w:rPr>
+                <w:rFonts w:ascii="Times New Roman" w:hAnsi="Times New Roman" w:eastAsia="Times New Roman"/>
+                <w:b w:val="0"/>
+                <w:sz w:val="22"/>
+              </w:rPr>
+              <w:t>PP3</w:t>
+            </w:r>
+          </w:p>
+        </w:tc>
+        <w:tc>
+          <w:tcPr>
+            <w:tcW w:type="dxa" w:w="2551"/>
+          </w:tcPr>
+          <w:p>
+            <w:pPr>
+              <w:jc w:val="left"/>
+            </w:pPr>
+            <w:r/>
+            <w:r>
+              <w:rPr>
+                <w:rFonts w:ascii="Times New Roman" w:hAnsi="Times New Roman" w:eastAsia="Times New Roman"/>
+                <w:b w:val="0"/>
+                <w:sz w:val="22"/>
+              </w:rPr>
+              <w:t>Cán bộ một cửa quá tải, hướng dẫn lặp lại</w:t>
+            </w:r>
+          </w:p>
+        </w:tc>
+        <w:tc>
+          <w:tcPr>
+            <w:tcW w:type="dxa" w:w="4535"/>
+          </w:tcPr>
+          <w:p>
+            <w:pPr>
+              <w:jc w:val="left"/>
+            </w:pPr>
+            <w:r/>
+            <w:r>
+              <w:rPr>
+                <w:rFonts w:ascii="Times New Roman" w:hAnsi="Times New Roman" w:eastAsia="Times New Roman"/>
+                <w:b w:val="0"/>
+                <w:sz w:val="22"/>
+              </w:rPr>
+              <w:t>1 cán bộ tiếp ~50-70 lượt/ngày, 60% là hướng dẫn thủ tục</w:t>
+            </w:r>
+          </w:p>
+        </w:tc>
+        <w:tc>
+          <w:tcPr>
+            <w:tcW w:type="dxa" w:w="1701"/>
+          </w:tcPr>
+          <w:p>
+            <w:pPr>
+              <w:jc w:val="center"/>
+            </w:pPr>
+            <w:r/>
+            <w:r>
+              <w:rPr>
+                <w:rFonts w:ascii="Times New Roman" w:hAnsi="Times New Roman" w:eastAsia="Times New Roman"/>
+                <w:b w:val="0"/>
+                <w:sz w:val="22"/>
+              </w:rPr>
+              <w:t>Cán bộ, người dân chờ lâu</w:t>
+            </w:r>
+          </w:p>
+        </w:tc>
+      </w:tr>
+    </w:tbl>
+    <w:p>
+      <w:r>
+        <w:rPr>
+          <w:rFonts w:ascii="Times New Roman" w:hAnsi="Times New Roman" w:eastAsia="Times New Roman"/>
+          <w:b w:val="0"/>
+          <w:sz w:val="16"/>
+        </w:rPr>
+      </w:r>
+    </w:p>
+    <w:p>
+      <w:pPr>
+        <w:jc w:val="left"/>
+      </w:pPr>
+      <w:r>
+        <w:rPr>
+          <w:rFonts w:ascii="Times New Roman" w:hAnsi="Times New Roman" w:eastAsia="Times New Roman"/>
+          <w:b/>
+          <w:color w:val="0066CC"/>
+          <w:sz w:val="32"/>
+        </w:rPr>
+        <w:t>1.3 Tại sao AI là giải pháp?</w:t>
+      </w:r>
+    </w:p>
+    <w:p>
+      <w:pPr>
+        <w:spacing w:line="360" w:lineRule="auto"/>
+        <w:ind w:firstLine="720"/>
+        <w:jc w:val="both"/>
+      </w:pPr>
+      <w:r>
+        <w:rPr>
+          <w:rFonts w:ascii="Times New Roman" w:hAnsi="Times New Roman" w:eastAsia="Times New Roman"/>
+          <w:b w:val="0"/>
+          <w:sz w:val="28"/>
+        </w:rPr>
+        <w:t>Ba pain-point trên đều có thể giải quyết bằng AI:</w:t>
+      </w:r>
+    </w:p>
+    <w:p>
+      <w:pPr>
+        <w:spacing w:line="360" w:lineRule="auto"/>
+        <w:ind w:left="850"/>
+        <w:jc w:val="both"/>
+      </w:pPr>
+      <w:r>
+        <w:rPr>
+          <w:rFonts w:ascii="Times New Roman" w:hAnsi="Times New Roman" w:eastAsia="Times New Roman"/>
+          <w:b/>
+          <w:sz w:val="28"/>
+        </w:rPr>
+        <w:t xml:space="preserve">• </w:t>
+      </w:r>
+      <w:r>
+        <w:rPr>
+          <w:rFonts w:ascii="Times New Roman" w:hAnsi="Times New Roman" w:eastAsia="Times New Roman"/>
+          <w:b/>
+          <w:sz w:val="28"/>
+        </w:rPr>
+        <w:t xml:space="preserve">PP1 → </w:t>
+      </w:r>
+      <w:r>
+        <w:rPr>
+          <w:rFonts w:ascii="Times New Roman" w:hAnsi="Times New Roman" w:eastAsia="Times New Roman"/>
+          <w:b w:val="0"/>
+          <w:sz w:val="28"/>
+        </w:rPr>
+        <w:t>Xử lý ngôn ngữ tự nhiên (NLP): Voice + Smartbot giúp người dân nói thay vì gõ</w:t>
+      </w:r>
+    </w:p>
+    <w:p>
+      <w:pPr>
+        <w:spacing w:line="360" w:lineRule="auto"/>
+        <w:ind w:left="850"/>
+        <w:jc w:val="both"/>
+      </w:pPr>
+      <w:r>
+        <w:rPr>
+          <w:rFonts w:ascii="Times New Roman" w:hAnsi="Times New Roman" w:eastAsia="Times New Roman"/>
+          <w:b/>
+          <w:sz w:val="28"/>
+        </w:rPr>
+        <w:t xml:space="preserve">• </w:t>
+      </w:r>
+      <w:r>
+        <w:rPr>
+          <w:rFonts w:ascii="Times New Roman" w:hAnsi="Times New Roman" w:eastAsia="Times New Roman"/>
+          <w:b/>
+          <w:sz w:val="28"/>
+        </w:rPr>
+        <w:t xml:space="preserve">PP2 → </w:t>
+      </w:r>
+      <w:r>
+        <w:rPr>
+          <w:rFonts w:ascii="Times New Roman" w:hAnsi="Times New Roman" w:eastAsia="Times New Roman"/>
+          <w:b w:val="0"/>
+          <w:sz w:val="28"/>
+        </w:rPr>
+        <w:t>Thị giác máy tính (Computer Vision): OCR + eKYC tự động nhận dạng giấy tờ</w:t>
+      </w:r>
+    </w:p>
+    <w:p>
+      <w:pPr>
+        <w:spacing w:line="360" w:lineRule="auto"/>
+        <w:ind w:left="850"/>
+        <w:jc w:val="both"/>
+      </w:pPr>
+      <w:r>
+        <w:rPr>
+          <w:rFonts w:ascii="Times New Roman" w:hAnsi="Times New Roman" w:eastAsia="Times New Roman"/>
+          <w:b/>
+          <w:sz w:val="28"/>
+        </w:rPr>
+        <w:t xml:space="preserve">• </w:t>
+      </w:r>
+      <w:r>
+        <w:rPr>
+          <w:rFonts w:ascii="Times New Roman" w:hAnsi="Times New Roman" w:eastAsia="Times New Roman"/>
+          <w:b/>
+          <w:sz w:val="28"/>
+        </w:rPr>
+        <w:t xml:space="preserve">PP3 → </w:t>
+      </w:r>
+      <w:r>
+        <w:rPr>
+          <w:rFonts w:ascii="Times New Roman" w:hAnsi="Times New Roman" w:eastAsia="Times New Roman"/>
+          <w:b w:val="0"/>
+          <w:sz w:val="28"/>
+        </w:rPr>
+        <w:t>Tự động hóa quy trình: AI xử lý câu hỏi lặp lại, giảm tải 40%</w:t>
+      </w:r>
+    </w:p>
+    <w:p>
+      <w:pPr>
+        <w:spacing w:line="360" w:lineRule="auto"/>
+        <w:ind w:firstLine="720"/>
+        <w:jc w:val="both"/>
+      </w:pPr>
+      <w:r>
+        <w:rPr>
+          <w:rFonts w:ascii="Times New Roman" w:hAnsi="Times New Roman" w:eastAsia="Times New Roman"/>
+          <w:b w:val="0"/>
+          <w:sz w:val="28"/>
+        </w:rPr>
+        <w:t>Công nghệ AI của VNPT được chọn vì: huấn luyện sẵn tiếng Việt, API sẵn sàng, đáp ứng bảo mật nhà nước.</w:t>
+      </w:r>
+    </w:p>
+    <w:p>
+      <w:pPr>
+        <w:jc w:val="left"/>
+      </w:pPr>
+      <w:r>
+        <w:rPr>
+          <w:rFonts w:ascii="Times New Roman" w:hAnsi="Times New Roman" w:eastAsia="Times New Roman"/>
+          <w:b/>
+          <w:color w:val="0066CC"/>
+          <w:sz w:val="32"/>
+        </w:rPr>
+        <w:t>1.4 Từ vấn đề đến giải pháp</w:t>
+      </w:r>
+    </w:p>
+    <w:p>
+      <w:pPr>
+        <w:spacing w:line="360" w:lineRule="auto"/>
+        <w:ind w:firstLine="720"/>
+        <w:jc w:val="both"/>
+      </w:pPr>
+      <w:r>
+        <w:rPr>
+          <w:rFonts w:ascii="Times New Roman" w:hAnsi="Times New Roman" w:eastAsia="Times New Roman"/>
+          <w:b w:val="0"/>
+          <w:sz w:val="28"/>
+        </w:rPr>
+        <w:t>Xuất phát từ thực tế đó, chúng tôi đề xuất VoiceOne — trợ lý ảo đa kênh (Kiosk + Web + Mobile) cho phép người dân tương tác hoàn toàn bằng giọng nói với hệ thống dịch vụ công. VoiceOne kết hợp 4 công nghệ AI cốt lõi của VNPT: Xử lý giọng nói (SmartVoice), Hiểu ngôn ngữ (Smartbot), Nhận dạng giấy tờ (eKYC/SmartReader), và Phân tích hình ảnh (SmartVision) — tạo nên một trải nghiệm không chạm, không gõ, không rào cản.</w:t>
       </w:r>
     </w:p>
     <w:sectPr>

</xml_diff>